<commit_message>
Se realizan cambios en la plantilla para mejorar la ubicación de las tablas con la información a llenar
</commit_message>
<xml_diff>
--- a/assets/templates/ats_template.docx
+++ b/assets/templates/ats_template.docx
@@ -4183,6 +4183,26 @@
         </w:rPr>
       </w:pPr>
     </w:p>
+    <w:p>
+      <w:pPr>
+        <w:spacing w:line="276" w:lineRule="auto"/>
+        <w:rPr>
+          <w:rFonts w:ascii="Montserrat Light" w:hAnsi="Montserrat Light"/>
+          <w:sz w:val="8"/>
+          <w:szCs w:val="18"/>
+        </w:rPr>
+      </w:pPr>
+    </w:p>
+    <w:p>
+      <w:pPr>
+        <w:spacing w:line="276" w:lineRule="auto"/>
+        <w:rPr>
+          <w:rFonts w:ascii="Montserrat Light" w:hAnsi="Montserrat Light"/>
+          <w:sz w:val="8"/>
+          <w:szCs w:val="18"/>
+        </w:rPr>
+      </w:pPr>
+    </w:p>
     <w:tbl>
       <w:tblPr>
         <w:tblpPr w:leftFromText="141" w:rightFromText="141" w:vertAnchor="text" w:horzAnchor="margin" w:tblpY="32"/>
@@ -4245,7 +4265,6 @@
                 <w:sz w:val="16"/>
                 <w:szCs w:val="16"/>
               </w:rPr>
-              <w:lastRenderedPageBreak/>
               <w:t>N°</w:t>
             </w:r>
             <w:proofErr w:type="spellEnd"/>
@@ -4385,9 +4404,7 @@
               <w:right w:val="inset" w:sz="6" w:space="0" w:color="F0F0F0"/>
             </w:tcBorders>
           </w:tcPr>
-          <w:p>
-            <w:r/>
-          </w:p>
+          <w:p/>
         </w:tc>
         <w:tc>
           <w:tcPr>
@@ -4397,9 +4414,7 @@
               <w:right w:val="inset" w:sz="6" w:space="0" w:color="auto"/>
             </w:tcBorders>
           </w:tcPr>
-          <w:p>
-            <w:r/>
-          </w:p>
+          <w:p/>
         </w:tc>
         <w:tc>
           <w:tcPr>
@@ -4410,12 +4425,1030 @@
             </w:tcBorders>
             <w:vAlign w:val="center"/>
           </w:tcPr>
-          <w:p>
-            <w:r/>
-          </w:p>
+          <w:p/>
         </w:tc>
       </w:tr>
     </w:tbl>
+    <w:p>
+      <w:pPr>
+        <w:spacing w:line="276" w:lineRule="auto"/>
+        <w:rPr>
+          <w:rFonts w:ascii="Montserrat Light" w:hAnsi="Montserrat Light"/>
+          <w:sz w:val="8"/>
+          <w:szCs w:val="18"/>
+        </w:rPr>
+      </w:pPr>
+    </w:p>
+    <w:p>
+      <w:pPr>
+        <w:spacing w:line="276" w:lineRule="auto"/>
+        <w:rPr>
+          <w:rFonts w:ascii="Montserrat Light" w:hAnsi="Montserrat Light"/>
+          <w:sz w:val="8"/>
+          <w:szCs w:val="18"/>
+        </w:rPr>
+      </w:pPr>
+    </w:p>
+    <w:p>
+      <w:pPr>
+        <w:spacing w:line="276" w:lineRule="auto"/>
+        <w:rPr>
+          <w:rFonts w:ascii="Montserrat Light" w:hAnsi="Montserrat Light"/>
+          <w:sz w:val="8"/>
+          <w:szCs w:val="18"/>
+        </w:rPr>
+      </w:pPr>
+    </w:p>
+    <w:p>
+      <w:pPr>
+        <w:spacing w:line="276" w:lineRule="auto"/>
+        <w:rPr>
+          <w:rFonts w:ascii="Montserrat Light" w:hAnsi="Montserrat Light"/>
+          <w:sz w:val="8"/>
+          <w:szCs w:val="18"/>
+        </w:rPr>
+      </w:pPr>
+    </w:p>
+    <w:p>
+      <w:pPr>
+        <w:spacing w:line="276" w:lineRule="auto"/>
+        <w:rPr>
+          <w:rFonts w:ascii="Montserrat Light" w:hAnsi="Montserrat Light"/>
+          <w:sz w:val="8"/>
+          <w:szCs w:val="18"/>
+        </w:rPr>
+      </w:pPr>
+    </w:p>
+    <w:p>
+      <w:pPr>
+        <w:spacing w:line="276" w:lineRule="auto"/>
+        <w:rPr>
+          <w:rFonts w:ascii="Montserrat Light" w:hAnsi="Montserrat Light"/>
+          <w:sz w:val="8"/>
+          <w:szCs w:val="18"/>
+        </w:rPr>
+      </w:pPr>
+    </w:p>
+    <w:p>
+      <w:pPr>
+        <w:spacing w:line="276" w:lineRule="auto"/>
+        <w:rPr>
+          <w:rFonts w:ascii="Montserrat Light" w:hAnsi="Montserrat Light"/>
+          <w:sz w:val="8"/>
+          <w:szCs w:val="18"/>
+        </w:rPr>
+      </w:pPr>
+    </w:p>
+    <w:p>
+      <w:pPr>
+        <w:spacing w:line="276" w:lineRule="auto"/>
+        <w:rPr>
+          <w:rFonts w:ascii="Montserrat Light" w:hAnsi="Montserrat Light"/>
+          <w:sz w:val="8"/>
+          <w:szCs w:val="18"/>
+        </w:rPr>
+      </w:pPr>
+    </w:p>
+    <w:p>
+      <w:pPr>
+        <w:spacing w:line="276" w:lineRule="auto"/>
+        <w:rPr>
+          <w:rFonts w:ascii="Montserrat Light" w:hAnsi="Montserrat Light"/>
+          <w:sz w:val="8"/>
+          <w:szCs w:val="18"/>
+        </w:rPr>
+      </w:pPr>
+    </w:p>
+    <w:p>
+      <w:pPr>
+        <w:spacing w:line="276" w:lineRule="auto"/>
+        <w:rPr>
+          <w:rFonts w:ascii="Montserrat Light" w:hAnsi="Montserrat Light"/>
+          <w:sz w:val="8"/>
+          <w:szCs w:val="18"/>
+        </w:rPr>
+      </w:pPr>
+    </w:p>
+    <w:p>
+      <w:pPr>
+        <w:spacing w:line="276" w:lineRule="auto"/>
+        <w:rPr>
+          <w:rFonts w:ascii="Montserrat Light" w:hAnsi="Montserrat Light"/>
+          <w:sz w:val="8"/>
+          <w:szCs w:val="18"/>
+        </w:rPr>
+      </w:pPr>
+    </w:p>
+    <w:p>
+      <w:pPr>
+        <w:spacing w:line="276" w:lineRule="auto"/>
+        <w:rPr>
+          <w:rFonts w:ascii="Montserrat Light" w:hAnsi="Montserrat Light"/>
+          <w:sz w:val="8"/>
+          <w:szCs w:val="18"/>
+        </w:rPr>
+      </w:pPr>
+    </w:p>
+    <w:p>
+      <w:pPr>
+        <w:spacing w:line="276" w:lineRule="auto"/>
+        <w:rPr>
+          <w:rFonts w:ascii="Montserrat Light" w:hAnsi="Montserrat Light"/>
+          <w:sz w:val="8"/>
+          <w:szCs w:val="18"/>
+        </w:rPr>
+      </w:pPr>
+    </w:p>
+    <w:p>
+      <w:pPr>
+        <w:spacing w:line="276" w:lineRule="auto"/>
+        <w:rPr>
+          <w:rFonts w:ascii="Montserrat Light" w:hAnsi="Montserrat Light"/>
+          <w:sz w:val="8"/>
+          <w:szCs w:val="18"/>
+        </w:rPr>
+      </w:pPr>
+    </w:p>
+    <w:p>
+      <w:pPr>
+        <w:spacing w:line="276" w:lineRule="auto"/>
+        <w:rPr>
+          <w:rFonts w:ascii="Montserrat Light" w:hAnsi="Montserrat Light"/>
+          <w:sz w:val="8"/>
+          <w:szCs w:val="18"/>
+        </w:rPr>
+      </w:pPr>
+    </w:p>
+    <w:p>
+      <w:pPr>
+        <w:spacing w:line="276" w:lineRule="auto"/>
+        <w:rPr>
+          <w:rFonts w:ascii="Montserrat Light" w:hAnsi="Montserrat Light"/>
+          <w:sz w:val="8"/>
+          <w:szCs w:val="18"/>
+        </w:rPr>
+      </w:pPr>
+    </w:p>
+    <w:p>
+      <w:pPr>
+        <w:spacing w:line="276" w:lineRule="auto"/>
+        <w:rPr>
+          <w:rFonts w:ascii="Montserrat Light" w:hAnsi="Montserrat Light"/>
+          <w:sz w:val="8"/>
+          <w:szCs w:val="18"/>
+        </w:rPr>
+      </w:pPr>
+    </w:p>
+    <w:p>
+      <w:pPr>
+        <w:spacing w:line="276" w:lineRule="auto"/>
+        <w:rPr>
+          <w:rFonts w:ascii="Montserrat Light" w:hAnsi="Montserrat Light"/>
+          <w:sz w:val="8"/>
+          <w:szCs w:val="18"/>
+        </w:rPr>
+      </w:pPr>
+    </w:p>
+    <w:p>
+      <w:pPr>
+        <w:spacing w:line="276" w:lineRule="auto"/>
+        <w:rPr>
+          <w:rFonts w:ascii="Montserrat Light" w:hAnsi="Montserrat Light"/>
+          <w:sz w:val="8"/>
+          <w:szCs w:val="18"/>
+        </w:rPr>
+      </w:pPr>
+    </w:p>
+    <w:p>
+      <w:pPr>
+        <w:spacing w:line="276" w:lineRule="auto"/>
+        <w:rPr>
+          <w:rFonts w:ascii="Montserrat Light" w:hAnsi="Montserrat Light"/>
+          <w:sz w:val="8"/>
+          <w:szCs w:val="18"/>
+        </w:rPr>
+      </w:pPr>
+    </w:p>
+    <w:p>
+      <w:pPr>
+        <w:spacing w:line="276" w:lineRule="auto"/>
+        <w:rPr>
+          <w:rFonts w:ascii="Montserrat Light" w:hAnsi="Montserrat Light"/>
+          <w:sz w:val="8"/>
+          <w:szCs w:val="18"/>
+        </w:rPr>
+      </w:pPr>
+    </w:p>
+    <w:p>
+      <w:pPr>
+        <w:spacing w:line="276" w:lineRule="auto"/>
+        <w:rPr>
+          <w:rFonts w:ascii="Montserrat Light" w:hAnsi="Montserrat Light"/>
+          <w:sz w:val="8"/>
+          <w:szCs w:val="18"/>
+        </w:rPr>
+      </w:pPr>
+    </w:p>
+    <w:p>
+      <w:pPr>
+        <w:spacing w:line="276" w:lineRule="auto"/>
+        <w:rPr>
+          <w:rFonts w:ascii="Montserrat Light" w:hAnsi="Montserrat Light"/>
+          <w:sz w:val="8"/>
+          <w:szCs w:val="18"/>
+        </w:rPr>
+      </w:pPr>
+    </w:p>
+    <w:p>
+      <w:pPr>
+        <w:spacing w:line="276" w:lineRule="auto"/>
+        <w:rPr>
+          <w:rFonts w:ascii="Montserrat Light" w:hAnsi="Montserrat Light"/>
+          <w:sz w:val="8"/>
+          <w:szCs w:val="18"/>
+        </w:rPr>
+      </w:pPr>
+    </w:p>
+    <w:p>
+      <w:pPr>
+        <w:spacing w:line="276" w:lineRule="auto"/>
+        <w:rPr>
+          <w:rFonts w:ascii="Montserrat Light" w:hAnsi="Montserrat Light"/>
+          <w:sz w:val="8"/>
+          <w:szCs w:val="18"/>
+        </w:rPr>
+      </w:pPr>
+    </w:p>
+    <w:p>
+      <w:pPr>
+        <w:spacing w:line="276" w:lineRule="auto"/>
+        <w:rPr>
+          <w:rFonts w:ascii="Montserrat Light" w:hAnsi="Montserrat Light"/>
+          <w:sz w:val="8"/>
+          <w:szCs w:val="18"/>
+        </w:rPr>
+      </w:pPr>
+    </w:p>
+    <w:p>
+      <w:pPr>
+        <w:spacing w:line="276" w:lineRule="auto"/>
+        <w:rPr>
+          <w:rFonts w:ascii="Montserrat Light" w:hAnsi="Montserrat Light"/>
+          <w:sz w:val="8"/>
+          <w:szCs w:val="18"/>
+        </w:rPr>
+      </w:pPr>
+    </w:p>
+    <w:p>
+      <w:pPr>
+        <w:spacing w:line="276" w:lineRule="auto"/>
+        <w:rPr>
+          <w:rFonts w:ascii="Montserrat Light" w:hAnsi="Montserrat Light"/>
+          <w:sz w:val="8"/>
+          <w:szCs w:val="18"/>
+        </w:rPr>
+      </w:pPr>
+    </w:p>
+    <w:p>
+      <w:pPr>
+        <w:spacing w:line="276" w:lineRule="auto"/>
+        <w:rPr>
+          <w:rFonts w:ascii="Montserrat Light" w:hAnsi="Montserrat Light"/>
+          <w:sz w:val="8"/>
+          <w:szCs w:val="18"/>
+        </w:rPr>
+      </w:pPr>
+    </w:p>
+    <w:p>
+      <w:pPr>
+        <w:spacing w:line="276" w:lineRule="auto"/>
+        <w:rPr>
+          <w:rFonts w:ascii="Montserrat Light" w:hAnsi="Montserrat Light"/>
+          <w:sz w:val="8"/>
+          <w:szCs w:val="18"/>
+        </w:rPr>
+      </w:pPr>
+    </w:p>
+    <w:p>
+      <w:pPr>
+        <w:spacing w:line="276" w:lineRule="auto"/>
+        <w:rPr>
+          <w:rFonts w:ascii="Montserrat Light" w:hAnsi="Montserrat Light"/>
+          <w:sz w:val="8"/>
+          <w:szCs w:val="18"/>
+        </w:rPr>
+      </w:pPr>
+    </w:p>
+    <w:p>
+      <w:pPr>
+        <w:spacing w:line="276" w:lineRule="auto"/>
+        <w:rPr>
+          <w:rFonts w:ascii="Montserrat Light" w:hAnsi="Montserrat Light"/>
+          <w:sz w:val="8"/>
+          <w:szCs w:val="18"/>
+        </w:rPr>
+      </w:pPr>
+    </w:p>
+    <w:p>
+      <w:pPr>
+        <w:spacing w:line="276" w:lineRule="auto"/>
+        <w:rPr>
+          <w:rFonts w:ascii="Montserrat Light" w:hAnsi="Montserrat Light"/>
+          <w:sz w:val="8"/>
+          <w:szCs w:val="18"/>
+        </w:rPr>
+      </w:pPr>
+    </w:p>
+    <w:p>
+      <w:pPr>
+        <w:spacing w:line="276" w:lineRule="auto"/>
+        <w:rPr>
+          <w:rFonts w:ascii="Montserrat Light" w:hAnsi="Montserrat Light"/>
+          <w:sz w:val="8"/>
+          <w:szCs w:val="18"/>
+        </w:rPr>
+      </w:pPr>
+    </w:p>
+    <w:p>
+      <w:pPr>
+        <w:spacing w:line="276" w:lineRule="auto"/>
+        <w:rPr>
+          <w:rFonts w:ascii="Montserrat Light" w:hAnsi="Montserrat Light"/>
+          <w:sz w:val="8"/>
+          <w:szCs w:val="18"/>
+        </w:rPr>
+      </w:pPr>
+    </w:p>
+    <w:p>
+      <w:pPr>
+        <w:spacing w:line="276" w:lineRule="auto"/>
+        <w:rPr>
+          <w:rFonts w:ascii="Montserrat Light" w:hAnsi="Montserrat Light"/>
+          <w:sz w:val="8"/>
+          <w:szCs w:val="18"/>
+        </w:rPr>
+      </w:pPr>
+    </w:p>
+    <w:p>
+      <w:pPr>
+        <w:spacing w:line="276" w:lineRule="auto"/>
+        <w:rPr>
+          <w:rFonts w:ascii="Montserrat Light" w:hAnsi="Montserrat Light"/>
+          <w:sz w:val="8"/>
+          <w:szCs w:val="18"/>
+        </w:rPr>
+      </w:pPr>
+    </w:p>
+    <w:p>
+      <w:pPr>
+        <w:spacing w:line="276" w:lineRule="auto"/>
+        <w:rPr>
+          <w:rFonts w:ascii="Montserrat Light" w:hAnsi="Montserrat Light"/>
+          <w:sz w:val="8"/>
+          <w:szCs w:val="18"/>
+        </w:rPr>
+      </w:pPr>
+    </w:p>
+    <w:p>
+      <w:pPr>
+        <w:spacing w:line="276" w:lineRule="auto"/>
+        <w:rPr>
+          <w:rFonts w:ascii="Montserrat Light" w:hAnsi="Montserrat Light"/>
+          <w:sz w:val="8"/>
+          <w:szCs w:val="18"/>
+        </w:rPr>
+      </w:pPr>
+    </w:p>
+    <w:p>
+      <w:pPr>
+        <w:spacing w:line="276" w:lineRule="auto"/>
+        <w:rPr>
+          <w:rFonts w:ascii="Montserrat Light" w:hAnsi="Montserrat Light"/>
+          <w:sz w:val="8"/>
+          <w:szCs w:val="18"/>
+        </w:rPr>
+      </w:pPr>
+    </w:p>
+    <w:p>
+      <w:pPr>
+        <w:spacing w:line="276" w:lineRule="auto"/>
+        <w:rPr>
+          <w:rFonts w:ascii="Montserrat Light" w:hAnsi="Montserrat Light"/>
+          <w:sz w:val="8"/>
+          <w:szCs w:val="18"/>
+        </w:rPr>
+      </w:pPr>
+    </w:p>
+    <w:p>
+      <w:pPr>
+        <w:spacing w:line="276" w:lineRule="auto"/>
+        <w:rPr>
+          <w:rFonts w:ascii="Montserrat Light" w:hAnsi="Montserrat Light"/>
+          <w:sz w:val="8"/>
+          <w:szCs w:val="18"/>
+        </w:rPr>
+      </w:pPr>
+    </w:p>
+    <w:p>
+      <w:pPr>
+        <w:spacing w:line="276" w:lineRule="auto"/>
+        <w:rPr>
+          <w:rFonts w:ascii="Montserrat Light" w:hAnsi="Montserrat Light"/>
+          <w:sz w:val="8"/>
+          <w:szCs w:val="18"/>
+        </w:rPr>
+      </w:pPr>
+    </w:p>
+    <w:p>
+      <w:pPr>
+        <w:spacing w:line="276" w:lineRule="auto"/>
+        <w:rPr>
+          <w:rFonts w:ascii="Montserrat Light" w:hAnsi="Montserrat Light"/>
+          <w:sz w:val="8"/>
+          <w:szCs w:val="18"/>
+        </w:rPr>
+      </w:pPr>
+    </w:p>
+    <w:p>
+      <w:pPr>
+        <w:spacing w:line="276" w:lineRule="auto"/>
+        <w:rPr>
+          <w:rFonts w:ascii="Montserrat Light" w:hAnsi="Montserrat Light"/>
+          <w:sz w:val="8"/>
+          <w:szCs w:val="18"/>
+        </w:rPr>
+      </w:pPr>
+    </w:p>
+    <w:p>
+      <w:pPr>
+        <w:spacing w:line="276" w:lineRule="auto"/>
+        <w:rPr>
+          <w:rFonts w:ascii="Montserrat Light" w:hAnsi="Montserrat Light"/>
+          <w:sz w:val="8"/>
+          <w:szCs w:val="18"/>
+        </w:rPr>
+      </w:pPr>
+    </w:p>
+    <w:p>
+      <w:pPr>
+        <w:spacing w:line="276" w:lineRule="auto"/>
+        <w:rPr>
+          <w:rFonts w:ascii="Montserrat Light" w:hAnsi="Montserrat Light"/>
+          <w:sz w:val="8"/>
+          <w:szCs w:val="18"/>
+        </w:rPr>
+      </w:pPr>
+    </w:p>
+    <w:p>
+      <w:pPr>
+        <w:spacing w:line="276" w:lineRule="auto"/>
+        <w:rPr>
+          <w:rFonts w:ascii="Montserrat Light" w:hAnsi="Montserrat Light"/>
+          <w:sz w:val="8"/>
+          <w:szCs w:val="18"/>
+        </w:rPr>
+      </w:pPr>
+    </w:p>
+    <w:p>
+      <w:pPr>
+        <w:spacing w:line="276" w:lineRule="auto"/>
+        <w:rPr>
+          <w:rFonts w:ascii="Montserrat Light" w:hAnsi="Montserrat Light"/>
+          <w:sz w:val="8"/>
+          <w:szCs w:val="18"/>
+        </w:rPr>
+      </w:pPr>
+    </w:p>
+    <w:p>
+      <w:pPr>
+        <w:spacing w:line="276" w:lineRule="auto"/>
+        <w:rPr>
+          <w:rFonts w:ascii="Montserrat Light" w:hAnsi="Montserrat Light"/>
+          <w:sz w:val="8"/>
+          <w:szCs w:val="18"/>
+        </w:rPr>
+      </w:pPr>
+    </w:p>
+    <w:p>
+      <w:pPr>
+        <w:spacing w:line="276" w:lineRule="auto"/>
+        <w:rPr>
+          <w:rFonts w:ascii="Montserrat Light" w:hAnsi="Montserrat Light"/>
+          <w:sz w:val="8"/>
+          <w:szCs w:val="18"/>
+        </w:rPr>
+      </w:pPr>
+    </w:p>
+    <w:p>
+      <w:pPr>
+        <w:spacing w:line="276" w:lineRule="auto"/>
+        <w:rPr>
+          <w:rFonts w:ascii="Montserrat Light" w:hAnsi="Montserrat Light"/>
+          <w:sz w:val="8"/>
+          <w:szCs w:val="18"/>
+        </w:rPr>
+      </w:pPr>
+    </w:p>
+    <w:p>
+      <w:pPr>
+        <w:spacing w:line="276" w:lineRule="auto"/>
+        <w:rPr>
+          <w:rFonts w:ascii="Montserrat Light" w:hAnsi="Montserrat Light"/>
+          <w:sz w:val="8"/>
+          <w:szCs w:val="18"/>
+        </w:rPr>
+      </w:pPr>
+    </w:p>
+    <w:p>
+      <w:pPr>
+        <w:spacing w:line="276" w:lineRule="auto"/>
+        <w:rPr>
+          <w:rFonts w:ascii="Montserrat Light" w:hAnsi="Montserrat Light"/>
+          <w:sz w:val="8"/>
+          <w:szCs w:val="18"/>
+        </w:rPr>
+      </w:pPr>
+    </w:p>
+    <w:p>
+      <w:pPr>
+        <w:spacing w:line="276" w:lineRule="auto"/>
+        <w:rPr>
+          <w:rFonts w:ascii="Montserrat Light" w:hAnsi="Montserrat Light"/>
+          <w:sz w:val="8"/>
+          <w:szCs w:val="18"/>
+        </w:rPr>
+      </w:pPr>
+    </w:p>
+    <w:p>
+      <w:pPr>
+        <w:spacing w:line="276" w:lineRule="auto"/>
+        <w:rPr>
+          <w:rFonts w:ascii="Montserrat Light" w:hAnsi="Montserrat Light"/>
+          <w:sz w:val="8"/>
+          <w:szCs w:val="18"/>
+        </w:rPr>
+      </w:pPr>
+    </w:p>
+    <w:p>
+      <w:pPr>
+        <w:spacing w:line="276" w:lineRule="auto"/>
+        <w:rPr>
+          <w:rFonts w:ascii="Montserrat Light" w:hAnsi="Montserrat Light"/>
+          <w:sz w:val="8"/>
+          <w:szCs w:val="18"/>
+        </w:rPr>
+      </w:pPr>
+    </w:p>
+    <w:p>
+      <w:pPr>
+        <w:spacing w:line="276" w:lineRule="auto"/>
+        <w:rPr>
+          <w:rFonts w:ascii="Montserrat Light" w:hAnsi="Montserrat Light"/>
+          <w:sz w:val="8"/>
+          <w:szCs w:val="18"/>
+        </w:rPr>
+      </w:pPr>
+    </w:p>
+    <w:p>
+      <w:pPr>
+        <w:spacing w:line="276" w:lineRule="auto"/>
+        <w:rPr>
+          <w:rFonts w:ascii="Montserrat Light" w:hAnsi="Montserrat Light"/>
+          <w:sz w:val="8"/>
+          <w:szCs w:val="18"/>
+        </w:rPr>
+      </w:pPr>
+    </w:p>
+    <w:p>
+      <w:pPr>
+        <w:spacing w:line="276" w:lineRule="auto"/>
+        <w:rPr>
+          <w:rFonts w:ascii="Montserrat Light" w:hAnsi="Montserrat Light"/>
+          <w:sz w:val="8"/>
+          <w:szCs w:val="18"/>
+        </w:rPr>
+      </w:pPr>
+    </w:p>
+    <w:p>
+      <w:pPr>
+        <w:spacing w:line="276" w:lineRule="auto"/>
+        <w:rPr>
+          <w:rFonts w:ascii="Montserrat Light" w:hAnsi="Montserrat Light"/>
+          <w:sz w:val="8"/>
+          <w:szCs w:val="18"/>
+        </w:rPr>
+      </w:pPr>
+    </w:p>
+    <w:p>
+      <w:pPr>
+        <w:spacing w:line="276" w:lineRule="auto"/>
+        <w:rPr>
+          <w:rFonts w:ascii="Montserrat Light" w:hAnsi="Montserrat Light"/>
+          <w:sz w:val="8"/>
+          <w:szCs w:val="18"/>
+        </w:rPr>
+      </w:pPr>
+    </w:p>
+    <w:p>
+      <w:pPr>
+        <w:spacing w:line="276" w:lineRule="auto"/>
+        <w:rPr>
+          <w:rFonts w:ascii="Montserrat Light" w:hAnsi="Montserrat Light"/>
+          <w:sz w:val="8"/>
+          <w:szCs w:val="18"/>
+        </w:rPr>
+      </w:pPr>
+    </w:p>
+    <w:p>
+      <w:pPr>
+        <w:spacing w:line="276" w:lineRule="auto"/>
+        <w:rPr>
+          <w:rFonts w:ascii="Montserrat Light" w:hAnsi="Montserrat Light"/>
+          <w:sz w:val="8"/>
+          <w:szCs w:val="18"/>
+        </w:rPr>
+      </w:pPr>
+    </w:p>
+    <w:p>
+      <w:pPr>
+        <w:spacing w:line="276" w:lineRule="auto"/>
+        <w:rPr>
+          <w:rFonts w:ascii="Montserrat Light" w:hAnsi="Montserrat Light"/>
+          <w:sz w:val="8"/>
+          <w:szCs w:val="18"/>
+        </w:rPr>
+      </w:pPr>
+    </w:p>
+    <w:p>
+      <w:pPr>
+        <w:spacing w:line="276" w:lineRule="auto"/>
+        <w:rPr>
+          <w:rFonts w:ascii="Montserrat Light" w:hAnsi="Montserrat Light"/>
+          <w:sz w:val="8"/>
+          <w:szCs w:val="18"/>
+        </w:rPr>
+      </w:pPr>
+    </w:p>
+    <w:p>
+      <w:pPr>
+        <w:spacing w:line="276" w:lineRule="auto"/>
+        <w:rPr>
+          <w:rFonts w:ascii="Montserrat Light" w:hAnsi="Montserrat Light"/>
+          <w:sz w:val="8"/>
+          <w:szCs w:val="18"/>
+        </w:rPr>
+      </w:pPr>
+    </w:p>
+    <w:p>
+      <w:pPr>
+        <w:spacing w:line="276" w:lineRule="auto"/>
+        <w:rPr>
+          <w:rFonts w:ascii="Montserrat Light" w:hAnsi="Montserrat Light"/>
+          <w:sz w:val="8"/>
+          <w:szCs w:val="18"/>
+        </w:rPr>
+      </w:pPr>
+    </w:p>
+    <w:p>
+      <w:pPr>
+        <w:spacing w:line="276" w:lineRule="auto"/>
+        <w:rPr>
+          <w:rFonts w:ascii="Montserrat Light" w:hAnsi="Montserrat Light"/>
+          <w:sz w:val="8"/>
+          <w:szCs w:val="18"/>
+        </w:rPr>
+      </w:pPr>
+    </w:p>
+    <w:p>
+      <w:pPr>
+        <w:spacing w:line="276" w:lineRule="auto"/>
+        <w:rPr>
+          <w:rFonts w:ascii="Montserrat Light" w:hAnsi="Montserrat Light"/>
+          <w:sz w:val="8"/>
+          <w:szCs w:val="18"/>
+        </w:rPr>
+      </w:pPr>
+    </w:p>
+    <w:p>
+      <w:pPr>
+        <w:spacing w:line="276" w:lineRule="auto"/>
+        <w:rPr>
+          <w:rFonts w:ascii="Montserrat Light" w:hAnsi="Montserrat Light"/>
+          <w:sz w:val="8"/>
+          <w:szCs w:val="18"/>
+        </w:rPr>
+      </w:pPr>
+    </w:p>
+    <w:p>
+      <w:pPr>
+        <w:spacing w:line="276" w:lineRule="auto"/>
+        <w:rPr>
+          <w:rFonts w:ascii="Montserrat Light" w:hAnsi="Montserrat Light"/>
+          <w:sz w:val="8"/>
+          <w:szCs w:val="18"/>
+        </w:rPr>
+      </w:pPr>
+    </w:p>
+    <w:p>
+      <w:pPr>
+        <w:spacing w:line="276" w:lineRule="auto"/>
+        <w:rPr>
+          <w:rFonts w:ascii="Montserrat Light" w:hAnsi="Montserrat Light"/>
+          <w:sz w:val="8"/>
+          <w:szCs w:val="18"/>
+        </w:rPr>
+      </w:pPr>
+    </w:p>
+    <w:p>
+      <w:pPr>
+        <w:spacing w:line="276" w:lineRule="auto"/>
+        <w:rPr>
+          <w:rFonts w:ascii="Montserrat Light" w:hAnsi="Montserrat Light"/>
+          <w:sz w:val="8"/>
+          <w:szCs w:val="18"/>
+        </w:rPr>
+      </w:pPr>
+    </w:p>
+    <w:p>
+      <w:pPr>
+        <w:spacing w:line="276" w:lineRule="auto"/>
+        <w:rPr>
+          <w:rFonts w:ascii="Montserrat Light" w:hAnsi="Montserrat Light"/>
+          <w:sz w:val="8"/>
+          <w:szCs w:val="18"/>
+        </w:rPr>
+      </w:pPr>
+    </w:p>
+    <w:p>
+      <w:pPr>
+        <w:spacing w:line="276" w:lineRule="auto"/>
+        <w:rPr>
+          <w:rFonts w:ascii="Montserrat Light" w:hAnsi="Montserrat Light"/>
+          <w:sz w:val="8"/>
+          <w:szCs w:val="18"/>
+        </w:rPr>
+      </w:pPr>
+    </w:p>
+    <w:p>
+      <w:pPr>
+        <w:spacing w:line="276" w:lineRule="auto"/>
+        <w:rPr>
+          <w:rFonts w:ascii="Montserrat Light" w:hAnsi="Montserrat Light"/>
+          <w:sz w:val="8"/>
+          <w:szCs w:val="18"/>
+        </w:rPr>
+      </w:pPr>
+    </w:p>
+    <w:p>
+      <w:pPr>
+        <w:spacing w:line="276" w:lineRule="auto"/>
+        <w:rPr>
+          <w:rFonts w:ascii="Montserrat Light" w:hAnsi="Montserrat Light"/>
+          <w:sz w:val="8"/>
+          <w:szCs w:val="18"/>
+        </w:rPr>
+      </w:pPr>
+    </w:p>
+    <w:p>
+      <w:pPr>
+        <w:spacing w:line="276" w:lineRule="auto"/>
+        <w:rPr>
+          <w:rFonts w:ascii="Montserrat Light" w:hAnsi="Montserrat Light"/>
+          <w:sz w:val="8"/>
+          <w:szCs w:val="18"/>
+        </w:rPr>
+      </w:pPr>
+    </w:p>
+    <w:p>
+      <w:pPr>
+        <w:spacing w:line="276" w:lineRule="auto"/>
+        <w:rPr>
+          <w:rFonts w:ascii="Montserrat Light" w:hAnsi="Montserrat Light"/>
+          <w:sz w:val="8"/>
+          <w:szCs w:val="18"/>
+        </w:rPr>
+      </w:pPr>
+    </w:p>
+    <w:p>
+      <w:pPr>
+        <w:spacing w:line="276" w:lineRule="auto"/>
+        <w:rPr>
+          <w:rFonts w:ascii="Montserrat Light" w:hAnsi="Montserrat Light"/>
+          <w:sz w:val="8"/>
+          <w:szCs w:val="18"/>
+        </w:rPr>
+      </w:pPr>
+    </w:p>
+    <w:p>
+      <w:pPr>
+        <w:spacing w:line="276" w:lineRule="auto"/>
+        <w:rPr>
+          <w:rFonts w:ascii="Montserrat Light" w:hAnsi="Montserrat Light"/>
+          <w:sz w:val="8"/>
+          <w:szCs w:val="18"/>
+        </w:rPr>
+      </w:pPr>
+    </w:p>
+    <w:p>
+      <w:pPr>
+        <w:spacing w:line="276" w:lineRule="auto"/>
+        <w:rPr>
+          <w:rFonts w:ascii="Montserrat Light" w:hAnsi="Montserrat Light"/>
+          <w:sz w:val="8"/>
+          <w:szCs w:val="18"/>
+        </w:rPr>
+      </w:pPr>
+    </w:p>
+    <w:p>
+      <w:pPr>
+        <w:spacing w:line="276" w:lineRule="auto"/>
+        <w:rPr>
+          <w:rFonts w:ascii="Montserrat Light" w:hAnsi="Montserrat Light"/>
+          <w:sz w:val="8"/>
+          <w:szCs w:val="18"/>
+        </w:rPr>
+      </w:pPr>
+    </w:p>
+    <w:p>
+      <w:pPr>
+        <w:spacing w:line="276" w:lineRule="auto"/>
+        <w:rPr>
+          <w:rFonts w:ascii="Montserrat Light" w:hAnsi="Montserrat Light"/>
+          <w:sz w:val="8"/>
+          <w:szCs w:val="18"/>
+        </w:rPr>
+      </w:pPr>
+    </w:p>
+    <w:p>
+      <w:pPr>
+        <w:spacing w:line="276" w:lineRule="auto"/>
+        <w:rPr>
+          <w:rFonts w:ascii="Montserrat Light" w:hAnsi="Montserrat Light"/>
+          <w:sz w:val="8"/>
+          <w:szCs w:val="18"/>
+        </w:rPr>
+      </w:pPr>
+    </w:p>
+    <w:p>
+      <w:pPr>
+        <w:spacing w:line="276" w:lineRule="auto"/>
+        <w:rPr>
+          <w:rFonts w:ascii="Montserrat Light" w:hAnsi="Montserrat Light"/>
+          <w:sz w:val="8"/>
+          <w:szCs w:val="18"/>
+        </w:rPr>
+      </w:pPr>
+    </w:p>
+    <w:p>
+      <w:pPr>
+        <w:spacing w:line="276" w:lineRule="auto"/>
+        <w:rPr>
+          <w:rFonts w:ascii="Montserrat Light" w:hAnsi="Montserrat Light"/>
+          <w:sz w:val="8"/>
+          <w:szCs w:val="18"/>
+        </w:rPr>
+      </w:pPr>
+    </w:p>
+    <w:p>
+      <w:pPr>
+        <w:spacing w:line="276" w:lineRule="auto"/>
+        <w:rPr>
+          <w:rFonts w:ascii="Montserrat Light" w:hAnsi="Montserrat Light"/>
+          <w:sz w:val="8"/>
+          <w:szCs w:val="18"/>
+        </w:rPr>
+      </w:pPr>
+    </w:p>
+    <w:p>
+      <w:pPr>
+        <w:spacing w:line="276" w:lineRule="auto"/>
+        <w:rPr>
+          <w:rFonts w:ascii="Montserrat Light" w:hAnsi="Montserrat Light"/>
+          <w:sz w:val="8"/>
+          <w:szCs w:val="18"/>
+        </w:rPr>
+      </w:pPr>
+    </w:p>
+    <w:p>
+      <w:pPr>
+        <w:spacing w:line="276" w:lineRule="auto"/>
+        <w:rPr>
+          <w:rFonts w:ascii="Montserrat Light" w:hAnsi="Montserrat Light"/>
+          <w:sz w:val="8"/>
+          <w:szCs w:val="18"/>
+        </w:rPr>
+      </w:pPr>
+    </w:p>
+    <w:p>
+      <w:pPr>
+        <w:spacing w:line="276" w:lineRule="auto"/>
+        <w:rPr>
+          <w:rFonts w:ascii="Montserrat Light" w:hAnsi="Montserrat Light"/>
+          <w:sz w:val="8"/>
+          <w:szCs w:val="18"/>
+        </w:rPr>
+      </w:pPr>
+    </w:p>
+    <w:p>
+      <w:pPr>
+        <w:spacing w:line="276" w:lineRule="auto"/>
+        <w:rPr>
+          <w:rFonts w:ascii="Montserrat Light" w:hAnsi="Montserrat Light"/>
+          <w:sz w:val="8"/>
+          <w:szCs w:val="18"/>
+        </w:rPr>
+      </w:pPr>
+    </w:p>
+    <w:p>
+      <w:pPr>
+        <w:spacing w:line="276" w:lineRule="auto"/>
+        <w:rPr>
+          <w:rFonts w:ascii="Montserrat Light" w:hAnsi="Montserrat Light"/>
+          <w:sz w:val="8"/>
+          <w:szCs w:val="18"/>
+        </w:rPr>
+      </w:pPr>
+    </w:p>
+    <w:p>
+      <w:pPr>
+        <w:spacing w:line="276" w:lineRule="auto"/>
+        <w:rPr>
+          <w:rFonts w:ascii="Montserrat Light" w:hAnsi="Montserrat Light"/>
+          <w:sz w:val="8"/>
+          <w:szCs w:val="18"/>
+        </w:rPr>
+      </w:pPr>
+    </w:p>
+    <w:p>
+      <w:pPr>
+        <w:spacing w:line="276" w:lineRule="auto"/>
+        <w:rPr>
+          <w:rFonts w:ascii="Montserrat Light" w:hAnsi="Montserrat Light"/>
+          <w:sz w:val="8"/>
+          <w:szCs w:val="18"/>
+        </w:rPr>
+      </w:pPr>
+    </w:p>
+    <w:p>
+      <w:pPr>
+        <w:spacing w:line="276" w:lineRule="auto"/>
+        <w:rPr>
+          <w:rFonts w:ascii="Montserrat Light" w:hAnsi="Montserrat Light"/>
+          <w:sz w:val="8"/>
+          <w:szCs w:val="18"/>
+        </w:rPr>
+      </w:pPr>
+    </w:p>
+    <w:p>
+      <w:pPr>
+        <w:spacing w:line="276" w:lineRule="auto"/>
+        <w:rPr>
+          <w:rFonts w:ascii="Montserrat Light" w:hAnsi="Montserrat Light"/>
+          <w:sz w:val="8"/>
+          <w:szCs w:val="18"/>
+        </w:rPr>
+      </w:pPr>
+    </w:p>
+    <w:p>
+      <w:pPr>
+        <w:spacing w:line="276" w:lineRule="auto"/>
+        <w:rPr>
+          <w:rFonts w:ascii="Montserrat Light" w:hAnsi="Montserrat Light"/>
+          <w:sz w:val="8"/>
+          <w:szCs w:val="18"/>
+        </w:rPr>
+      </w:pPr>
+    </w:p>
+    <w:p>
+      <w:pPr>
+        <w:spacing w:line="276" w:lineRule="auto"/>
+        <w:rPr>
+          <w:rFonts w:ascii="Montserrat Light" w:hAnsi="Montserrat Light"/>
+          <w:sz w:val="8"/>
+          <w:szCs w:val="18"/>
+        </w:rPr>
+      </w:pPr>
+    </w:p>
+    <w:p>
+      <w:pPr>
+        <w:spacing w:line="276" w:lineRule="auto"/>
+        <w:rPr>
+          <w:rFonts w:ascii="Montserrat Light" w:hAnsi="Montserrat Light"/>
+          <w:sz w:val="8"/>
+          <w:szCs w:val="18"/>
+        </w:rPr>
+      </w:pPr>
+    </w:p>
+    <w:p>
+      <w:pPr>
+        <w:spacing w:line="276" w:lineRule="auto"/>
+        <w:rPr>
+          <w:rFonts w:ascii="Montserrat Light" w:hAnsi="Montserrat Light"/>
+          <w:sz w:val="8"/>
+          <w:szCs w:val="18"/>
+        </w:rPr>
+      </w:pPr>
+    </w:p>
     <w:p>
       <w:pPr>
         <w:spacing w:line="276" w:lineRule="auto"/>
@@ -5243,26 +6276,6 @@
         </w:tc>
       </w:tr>
     </w:tbl>
-    <w:p>
-      <w:pPr>
-        <w:spacing w:line="276" w:lineRule="auto"/>
-        <w:rPr>
-          <w:rFonts w:ascii="Montserrat Light" w:hAnsi="Montserrat Light"/>
-          <w:sz w:val="14"/>
-          <w:szCs w:val="14"/>
-        </w:rPr>
-      </w:pPr>
-    </w:p>
-    <w:p>
-      <w:pPr>
-        <w:spacing w:line="276" w:lineRule="auto"/>
-        <w:rPr>
-          <w:rFonts w:ascii="Montserrat Light" w:hAnsi="Montserrat Light"/>
-          <w:sz w:val="14"/>
-          <w:szCs w:val="14"/>
-        </w:rPr>
-      </w:pPr>
-    </w:p>
     <w:p>
       <w:pPr>
         <w:spacing w:line="276" w:lineRule="auto"/>
@@ -8256,12 +9269,7 @@
 </file>
 
 <file path=customXml/item2.xml><?xml version="1.0" encoding="utf-8"?>
-<?mso-contentType ?>
-<FormTemplates xmlns="http://schemas.microsoft.com/sharepoint/v3/contenttype/forms">
-  <Display>DocumentLibraryForm</Display>
-  <Edit>DocumentLibraryForm</Edit>
-  <New>DocumentLibraryForm</New>
-</FormTemplates>
+<b:Sources xmlns:b="http://schemas.openxmlformats.org/officeDocument/2006/bibliography" xmlns="http://schemas.openxmlformats.org/officeDocument/2006/bibliography" SelectedStyle="\APASixthEditionOfficeOnline.xsl" StyleName="APA" Version="6"/>
 </file>
 
 <file path=customXml/item3.xml><?xml version="1.0" encoding="utf-8"?>
@@ -8276,7 +9284,12 @@
 </file>
 
 <file path=customXml/item4.xml><?xml version="1.0" encoding="utf-8"?>
-<b:Sources xmlns:b="http://schemas.openxmlformats.org/officeDocument/2006/bibliography" xmlns="http://schemas.openxmlformats.org/officeDocument/2006/bibliography" SelectedStyle="\APASixthEditionOfficeOnline.xsl" StyleName="APA" Version="6"/>
+<?mso-contentType ?>
+<FormTemplates xmlns="http://schemas.microsoft.com/sharepoint/v3/contenttype/forms">
+  <Display>DocumentLibraryForm</Display>
+  <Edit>DocumentLibraryForm</Edit>
+  <New>DocumentLibraryForm</New>
+</FormTemplates>
 </file>
 
 <file path=customXml/itemProps1.xml><?xml version="1.0" encoding="utf-8"?>
@@ -8299,9 +9312,9 @@
 </file>
 
 <file path=customXml/itemProps2.xml><?xml version="1.0" encoding="utf-8"?>
-<ds:datastoreItem xmlns:ds="http://schemas.openxmlformats.org/officeDocument/2006/customXml" ds:itemID="{455F3C7C-D6F7-48E4-92FD-3B9FEC0FA50D}">
+<ds:datastoreItem xmlns:ds="http://schemas.openxmlformats.org/officeDocument/2006/customXml" ds:itemID="{9C031497-1AAD-4A03-94C9-736C46114FEF}">
   <ds:schemaRefs>
-    <ds:schemaRef ds:uri="http://schemas.microsoft.com/sharepoint/v3/contenttype/forms"/>
+    <ds:schemaRef ds:uri="http://schemas.openxmlformats.org/officeDocument/2006/bibliography"/>
   </ds:schemaRefs>
 </ds:datastoreItem>
 </file>
@@ -8318,9 +9331,9 @@
 </file>
 
 <file path=customXml/itemProps4.xml><?xml version="1.0" encoding="utf-8"?>
-<ds:datastoreItem xmlns:ds="http://schemas.openxmlformats.org/officeDocument/2006/customXml" ds:itemID="{9C031497-1AAD-4A03-94C9-736C46114FEF}">
+<ds:datastoreItem xmlns:ds="http://schemas.openxmlformats.org/officeDocument/2006/customXml" ds:itemID="{455F3C7C-D6F7-48E4-92FD-3B9FEC0FA50D}">
   <ds:schemaRefs>
-    <ds:schemaRef ds:uri="http://schemas.openxmlformats.org/officeDocument/2006/bibliography"/>
+    <ds:schemaRef ds:uri="http://schemas.microsoft.com/sharepoint/v3/contenttype/forms"/>
   </ds:schemaRefs>
 </ds:datastoreItem>
 </file>
</xml_diff>